<commit_message>
docs: refresh dashboard executive view documentation
</commit_message>
<xml_diff>
--- a/docs/WorkForce-Manager-Documentazione.docx
+++ b/docs/WorkForce-Manager-Documentazione.docx
@@ -15633,6 +15633,11 @@
       </w:r>
       <w:bookmarkEnd w:id="88"/>
       <w:bookmarkEnd w:id="108"/>
+    </w:p>
+    <w:p>
+      <w:r>
+        <w:t>Aggiornamento 2026-08-24: dashboard executive board con visualizzazione a heatmap a barre per confronto immediato del carico di lavoro del team, con soglie evidenziate e percentuali sempre leggibili.</w:t>
+      </w:r>
     </w:p>
     <w:sectPr>
       <w:footnotePr>

</xml_diff>

<commit_message>
feat: executive board dashboard + docs
</commit_message>
<xml_diff>
--- a/docs/WorkForce-Manager-Documentazione.docx
+++ b/docs/WorkForce-Manager-Documentazione.docx
@@ -15637,6 +15637,26 @@
     <w:p>
       <w:r>
         <w:t>Aggiornamento 2026-08-24: dashboard executive board con visualizzazione a heatmap a barre per confronto immediato del carico di lavoro del team, con soglie evidenziate e percentuali sempre leggibili.</w:t>
+      </w:r>
+    </w:p>
+    <w:p>
+      <w:r>
+        <w:t>Aggiornamento del 2026-08-24</w:t>
+      </w:r>
+    </w:p>
+    <w:p>
+      <w:r>
+        <w:t>Dashboard executive-board: la sezione Allocazione per persona usa una vista a barre orizzontali con drilldown on click.</w:t>
+      </w:r>
+    </w:p>
+    <w:p>
+      <w:r>
+        <w:t>Obiettivo: migliorare la leggibilità manageriale, il confronto rapido tra risorse e l'accesso immediato al dettaglio per persona.</w:t>
+      </w:r>
+    </w:p>
+    <w:p>
+      <w:r>
+        <w:t>Documentazione aggiornata in parallelo al refactor del dashboard e alla validazione test e type-check.</w:t>
       </w:r>
     </w:p>
     <w:sectPr>

</xml_diff>

<commit_message>
docs: regenerate unified Word documentation
</commit_message>
<xml_diff>
--- a/docs/WorkForce-Manager-Documentazione.docx
+++ b/docs/WorkForce-Manager-Documentazione.docx
@@ -3374,13 +3374,22 @@
         <w:t xml:space="preserve"> </w:t>
       </w:r>
       <w:r>
-        <w:t xml:space="preserve">generano mai HTML, l’accesso ai dati passa sempre da Drizzle (mai SQL grezzo</w:t>
-      </w:r>
-      <w:r>
-        <w:t xml:space="preserve"> </w:t>
-      </w:r>
-      <w:r>
-        <w:t xml:space="preserve">sparso nei router, salvo il singolo</w:t>
+        <w:t xml:space="preserve">generano mai HTML, l’accesso ai dati passa quasi sempre da Drizzle. Le due</w:t>
+      </w:r>
+      <w:r>
+        <w:t xml:space="preserve"> </w:t>
+      </w:r>
+      <w:r>
+        <w:t xml:space="preserve">sole eccezioni con SQL grezzo (</w:t>
+      </w:r>
+      <w:r>
+        <w:rPr>
+          <w:rStyle w:val="VerbatimChar"/>
+        </w:rPr>
+        <w:t xml:space="preserve">pool.query</w:t>
+      </w:r>
+      <w:r>
+        <w:t xml:space="preserve">) sono entrambe un</w:t>
       </w:r>
       <w:r>
         <w:t xml:space="preserve"> </w:t>
@@ -3392,16 +3401,22 @@
         <w:t xml:space="preserve">TRUNCATE</w:t>
       </w:r>
       <w:r>
-        <w:t xml:space="preserve"> </w:t>
-      </w:r>
-      <w:r>
-        <w:t xml:space="preserve">usato solo nell’harness dei</w:t>
-      </w:r>
-      <w:r>
-        <w:t xml:space="preserve"> </w:t>
-      </w:r>
-      <w:r>
-        <w:t xml:space="preserve">test â€” vedi</w:t>
+        <w:t xml:space="preserve">:</w:t>
+      </w:r>
+      <w:r>
+        <w:t xml:space="preserve"> </w:t>
+      </w:r>
+      <w:r>
+        <w:t xml:space="preserve">quello usato nell’harness dei test (</w:t>
+      </w:r>
+      <w:r>
+        <w:rPr>
+          <w:rStyle w:val="VerbatimChar"/>
+        </w:rPr>
+        <w:t xml:space="preserve">tests/integration/helpers.ts</w:t>
+      </w:r>
+      <w:r>
+        <w:t xml:space="preserve">, vedi</w:t>
       </w:r>
       <w:r>
         <w:t xml:space="preserve"> </w:t>
@@ -3415,7 +3430,70 @@
         </w:r>
       </w:hyperlink>
       <w:r>
-        <w:t xml:space="preserve">).</w:t>
+        <w:t xml:space="preserve">) e quello dietro l’endpoint</w:t>
+      </w:r>
+      <w:r>
+        <w:t xml:space="preserve"> </w:t>
+      </w:r>
+      <w:r>
+        <w:t xml:space="preserve">amministrativo</w:t>
+      </w:r>
+      <w:r>
+        <w:t xml:space="preserve"> </w:t>
+      </w:r>
+      <w:r>
+        <w:rPr>
+          <w:rStyle w:val="VerbatimChar"/>
+        </w:rPr>
+        <w:t xml:space="preserve">POST /api/admin/reset-data</w:t>
+      </w:r>
+      <w:r>
+        <w:t xml:space="preserve"> </w:t>
+      </w:r>
+      <w:r>
+        <w:t xml:space="preserve">(</w:t>
+      </w:r>
+      <w:r>
+        <w:rPr>
+          <w:rStyle w:val="VerbatimChar"/>
+        </w:rPr>
+        <w:t xml:space="preserve">server/routes/admin.ts</w:t>
+      </w:r>
+      <w:r>
+        <w:t xml:space="preserve">) â€” quest’ultimo Ã¨ codice applicativo di</w:t>
+      </w:r>
+      <w:r>
+        <w:t xml:space="preserve"> </w:t>
+      </w:r>
+      <w:r>
+        <w:t xml:space="preserve">produzione, non solo di test, e tronca tutte le tabelle dati in un unico</w:t>
+      </w:r>
+      <w:r>
+        <w:t xml:space="preserve"> </w:t>
+      </w:r>
+      <w:r>
+        <w:t xml:space="preserve">statement (necessario per evitare deadlock da lock</w:t>
+      </w:r>
+      <w:r>
+        <w:t xml:space="preserve"> </w:t>
+      </w:r>
+      <w:r>
+        <w:rPr>
+          <w:rStyle w:val="VerbatimChar"/>
+        </w:rPr>
+        <w:t xml:space="preserve">CASCADE</w:t>
+      </w:r>
+      <w:r>
+        <w:t xml:space="preserve"> </w:t>
+      </w:r>
+      <w:r>
+        <w:t xml:space="preserve">su tabelle in</w:t>
+      </w:r>
+      <w:r>
+        <w:t xml:space="preserve"> </w:t>
+      </w:r>
+      <w:r>
+        <w:t xml:space="preserve">comune se eseguito come query separate in parallelo).</w:t>
       </w:r>
     </w:p>
     <w:bookmarkEnd w:id="49"/>
@@ -4654,6 +4732,85 @@
         <w:t xml:space="preserve">.</w:t>
       </w:r>
     </w:p>
+    <w:p>
+      <w:pPr>
+        <w:pStyle w:val="BodyText"/>
+      </w:pPr>
+      <w:r>
+        <w:t xml:space="preserve">Il diagramma sopra mostra solo la pipeline di deploy (</w:t>
+      </w:r>
+      <w:r>
+        <w:rPr>
+          <w:rStyle w:val="VerbatimChar"/>
+        </w:rPr>
+        <w:t xml:space="preserve">deploy.yml</w:t>
+      </w:r>
+      <w:r>
+        <w:t xml:space="preserve">). Un</w:t>
+      </w:r>
+      <w:r>
+        <w:t xml:space="preserve"> </w:t>
+      </w:r>
+      <w:r>
+        <w:t xml:space="preserve">secondo workflow indipendente,</w:t>
+      </w:r>
+      <w:r>
+        <w:t xml:space="preserve"> </w:t>
+      </w:r>
+      <w:r>
+        <w:rPr>
+          <w:rStyle w:val="VerbatimChar"/>
+        </w:rPr>
+        <w:t xml:space="preserve">sonar.yml</w:t>
+      </w:r>
+      <w:r>
+        <w:t xml:space="preserve">, esegue l’analisi SonarQube</w:t>
+      </w:r>
+      <w:r>
+        <w:t xml:space="preserve"> </w:t>
+      </w:r>
+      <w:r>
+        <w:t xml:space="preserve">(anch’esso con un Postgres effimero, per far girare i test di integrazione</w:t>
+      </w:r>
+      <w:r>
+        <w:t xml:space="preserve"> </w:t>
+      </w:r>
+      <w:r>
+        <w:t xml:space="preserve">e produrre la coverage) ma non fa parte della catena che porta al deploy:</w:t>
+      </w:r>
+      <w:r>
+        <w:t xml:space="preserve"> </w:t>
+      </w:r>
+      <w:r>
+        <w:t xml:space="preserve">non blocca nÃ© viene bloccato da</w:t>
+      </w:r>
+      <w:r>
+        <w:t xml:space="preserve"> </w:t>
+      </w:r>
+      <w:r>
+        <w:rPr>
+          <w:rStyle w:val="VerbatimChar"/>
+        </w:rPr>
+        <w:t xml:space="preserve">build-and-deploy</w:t>
+      </w:r>
+      <w:r>
+        <w:t xml:space="preserve">. Dettagli in</w:t>
+      </w:r>
+      <w:r>
+        <w:t xml:space="preserve"> </w:t>
+      </w:r>
+      <w:hyperlink r:id="rId80">
+        <w:r>
+          <w:rPr>
+            <w:rStyle w:val="Hyperlink"/>
+          </w:rPr>
+          <w:t xml:space="preserve">03-tecnica.md Â§CI/CD</w:t>
+        </w:r>
+      </w:hyperlink>
+      <w:r>
+        <w:t xml:space="preserve">.</w:t>
+      </w:r>
+    </w:p>
     <w:bookmarkEnd w:id="81"/>
     <w:bookmarkStart w:id="83" w:name="decisioni-architetturali-chiave"/>
     <w:p>
@@ -4991,7 +5148,7 @@
     </w:p>
     <w:bookmarkEnd w:id="83"/>
     <w:bookmarkEnd w:id="84"/>
-    <w:bookmarkStart w:id="102" w:name="documentazione-tecnica"/>
+    <w:bookmarkStart w:id="104" w:name="documentazione-tecnica"/>
     <w:p>
       <w:pPr>
         <w:pStyle w:val="Heading1"/>
@@ -5920,6 +6077,56 @@
               <w:pStyle w:val="Compact"/>
             </w:pPr>
             <w:r>
+              <w:t xml:space="preserve">@vitest/coverage-v8</w:t>
+            </w:r>
+          </w:p>
+        </w:tc>
+        <w:tc>
+          <w:tcPr/>
+          <w:p>
+            <w:pPr>
+              <w:pStyle w:val="Compact"/>
+            </w:pPr>
+            <w:r>
+              <w:t xml:space="preserve">4.1.10</w:t>
+            </w:r>
+          </w:p>
+        </w:tc>
+        <w:tc>
+          <w:tcPr/>
+          <w:p>
+            <w:pPr>
+              <w:pStyle w:val="Compact"/>
+            </w:pPr>
+            <w:r>
+              <w:t xml:space="preserve">Coverage (provider v8), report</w:t>
+            </w:r>
+            <w:r>
+              <w:t xml:space="preserve"> </w:t>
+            </w:r>
+            <w:r>
+              <w:rPr>
+                <w:rStyle w:val="VerbatimChar"/>
+              </w:rPr>
+              <w:t xml:space="preserve">lcov</w:t>
+            </w:r>
+            <w:r>
+              <w:t xml:space="preserve"> </w:t>
+            </w:r>
+            <w:r>
+              <w:t xml:space="preserve">consumato da SonarQube</w:t>
+            </w:r>
+          </w:p>
+        </w:tc>
+      </w:tr>
+      <w:tr>
+        <w:tc>
+          <w:tcPr/>
+          <w:p>
+            <w:pPr>
+              <w:pStyle w:val="Compact"/>
+            </w:pPr>
+            <w:r>
               <w:t xml:space="preserve">Supertest</w:t>
             </w:r>
           </w:p>
@@ -6021,7 +6228,22 @@
         <w:t xml:space="preserve"> </w:t>
       </w:r>
       <w:r>
-        <w:t xml:space="preserve">â€” pipeline</w:t>
+        <w:t xml:space="preserve">â€” due workflow indipendenti:</w:t>
+      </w:r>
+      <w:r>
+        <w:t xml:space="preserve"> </w:t>
+      </w:r>
+      <w:r>
+        <w:rPr>
+          <w:rStyle w:val="VerbatimChar"/>
+        </w:rPr>
+        <w:t xml:space="preserve">deploy.yml</w:t>
+      </w:r>
+      <w:r>
+        <w:t xml:space="preserve"> </w:t>
+      </w:r>
+      <w:r>
+        <w:t xml:space="preserve">(job</w:t>
       </w:r>
       <w:r>
         <w:t xml:space="preserve"> </w:t>
@@ -6046,6 +6268,30 @@
           <w:rStyle w:val="VerbatimChar"/>
         </w:rPr>
         <w:t xml:space="preserve">build-and-deploy</w:t>
+      </w:r>
+      <w:r>
+        <w:t xml:space="preserve">) e</w:t>
+      </w:r>
+      <w:r>
+        <w:t xml:space="preserve"> </w:t>
+      </w:r>
+      <w:r>
+        <w:rPr>
+          <w:rStyle w:val="VerbatimChar"/>
+        </w:rPr>
+        <w:t xml:space="preserve">sonar.yml</w:t>
+      </w:r>
+      <w:r>
+        <w:t xml:space="preserve"> </w:t>
+      </w:r>
+      <w:r>
+        <w:t xml:space="preserve">(analisi SonarQube, non collegato al</w:t>
+      </w:r>
+      <w:r>
+        <w:t xml:space="preserve"> </w:t>
+      </w:r>
+      <w:r>
+        <w:t xml:space="preserve">deploy)</w:t>
       </w:r>
     </w:p>
     <w:p>
@@ -6061,25 +6307,34 @@
           <w:b/>
           <w:bCs/>
         </w:rPr>
-        <w:t xml:space="preserve">Azure App Service</w:t>
-      </w:r>
-      <w:r>
-        <w:t xml:space="preserve"> </w:t>
-      </w:r>
-      <w:r>
-        <w:t xml:space="preserve">(Linux, piano</w:t>
-      </w:r>
-      <w:r>
-        <w:t xml:space="preserve"> </w:t>
-      </w:r>
-      <w:r>
-        <w:rPr>
-          <w:rStyle w:val="VerbatimChar"/>
-        </w:rPr>
-        <w:t xml:space="preserve">B1</w:t>
-      </w:r>
-      <w:r>
-        <w:t xml:space="preserve">) â€” hosting dell’applicazione</w:t>
+        <w:t xml:space="preserve">SonarQube</w:t>
+      </w:r>
+      <w:r>
+        <w:t xml:space="preserve"> </w:t>
+      </w:r>
+      <w:r>
+        <w:t xml:space="preserve">â€” analisi statica + coverage, eseguita manualmente</w:t>
+      </w:r>
+      <w:r>
+        <w:t xml:space="preserve"> </w:t>
+      </w:r>
+      <w:r>
+        <w:t xml:space="preserve">(</w:t>
+      </w:r>
+      <w:r>
+        <w:rPr>
+          <w:rStyle w:val="VerbatimChar"/>
+        </w:rPr>
+        <w:t xml:space="preserve">workflow_dispatch</w:t>
+      </w:r>
+      <w:r>
+        <w:t xml:space="preserve">) o ogni notte (schedule); quality gate configurato sul</w:t>
+      </w:r>
+      <w:r>
+        <w:t xml:space="preserve"> </w:t>
+      </w:r>
+      <w:r>
+        <w:t xml:space="preserve">progetto lato SonarQube</w:t>
       </w:r>
     </w:p>
     <w:p>
@@ -6095,6 +6350,40 @@
           <w:b/>
           <w:bCs/>
         </w:rPr>
+        <w:t xml:space="preserve">Azure App Service</w:t>
+      </w:r>
+      <w:r>
+        <w:t xml:space="preserve"> </w:t>
+      </w:r>
+      <w:r>
+        <w:t xml:space="preserve">(Linux, piano</w:t>
+      </w:r>
+      <w:r>
+        <w:t xml:space="preserve"> </w:t>
+      </w:r>
+      <w:r>
+        <w:rPr>
+          <w:rStyle w:val="VerbatimChar"/>
+        </w:rPr>
+        <w:t xml:space="preserve">B1</w:t>
+      </w:r>
+      <w:r>
+        <w:t xml:space="preserve">) â€” hosting dell’applicazione</w:t>
+      </w:r>
+    </w:p>
+    <w:p>
+      <w:pPr>
+        <w:pStyle w:val="Compact"/>
+        <w:numPr>
+          <w:ilvl w:val="0"/>
+          <w:numId w:val="1004"/>
+        </w:numPr>
+      </w:pPr>
+      <w:r>
+        <w:rPr>
+          <w:b/>
+          <w:bCs/>
+        </w:rPr>
         <w:t xml:space="preserve">Azure Database for PostgreSQL Flexible Server</w:t>
       </w:r>
       <w:r>
@@ -6420,7 +6709,34 @@
         <w:rPr>
           <w:rStyle w:val="VerbatimChar"/>
         </w:rPr>
-        <w:t xml:space="preserve">.github/workflows/deploy.yml â†’ pipeline CI/CD</w:t>
+        <w:t xml:space="preserve">.github/workflows/</w:t>
+      </w:r>
+      <w:r>
+        <w:br/>
+      </w:r>
+      <w:r>
+        <w:rPr>
+          <w:rStyle w:val="VerbatimChar"/>
+        </w:rPr>
+        <w:t xml:space="preserve">  deploy.yml              â†’ pipeline CI/CD (test â†’ build-and-deploy su Azure)</w:t>
+      </w:r>
+      <w:r>
+        <w:br/>
+      </w:r>
+      <w:r>
+        <w:rPr>
+          <w:rStyle w:val="VerbatimChar"/>
+        </w:rPr>
+        <w:t xml:space="preserve">  sonar.yml                â†’ analisi SonarQube (npm run test:coverage + scan)</w:t>
+      </w:r>
+      <w:r>
+        <w:br/>
+      </w:r>
+      <w:r>
+        <w:rPr>
+          <w:rStyle w:val="VerbatimChar"/>
+        </w:rPr>
+        <w:t xml:space="preserve">sonar-project.properties â†’ configurazione progetto SonarQube (sources, esclusioni, report coverage)</w:t>
       </w:r>
       <w:r>
         <w:br/>
@@ -8162,7 +8478,7 @@
         <w:rPr>
           <w:rStyle w:val="NormalTok"/>
         </w:rPr>
-        <w:t xml:space="preserve"> test          </w:t>
+        <w:t xml:space="preserve"> test              </w:t>
       </w:r>
       <w:r>
         <w:rPr>
@@ -8183,12 +8499,33 @@
         <w:rPr>
           <w:rStyle w:val="NormalTok"/>
         </w:rPr>
-        <w:t xml:space="preserve"> run test:e2e  </w:t>
+        <w:t xml:space="preserve"> run test:coverage </w:t>
       </w:r>
       <w:r>
         <w:rPr>
           <w:rStyle w:val="CommentTok"/>
         </w:rPr>
+        <w:t xml:space="preserve"># come sopra, con report coverage lcov in coverage/ (usato da Sonar)</w:t>
+      </w:r>
+      <w:r>
+        <w:br/>
+      </w:r>
+      <w:r>
+        <w:rPr>
+          <w:rStyle w:val="ExtensionTok"/>
+        </w:rPr>
+        <w:t xml:space="preserve">npm</w:t>
+      </w:r>
+      <w:r>
+        <w:rPr>
+          <w:rStyle w:val="NormalTok"/>
+        </w:rPr>
+        <w:t xml:space="preserve"> run test:e2e      </w:t>
+      </w:r>
+      <w:r>
+        <w:rPr>
+          <w:rStyle w:val="CommentTok"/>
+        </w:rPr>
         <w:t xml:space="preserve"># end-to-end (Playwright)</w:t>
       </w:r>
       <w:r>
@@ -8204,7 +8541,7 @@
         <w:rPr>
           <w:rStyle w:val="NormalTok"/>
         </w:rPr>
-        <w:t xml:space="preserve"> run check     </w:t>
+        <w:t xml:space="preserve"> run check         </w:t>
       </w:r>
       <w:r>
         <w:rPr>
@@ -8236,7 +8573,7 @@
       </w:r>
     </w:p>
     <w:bookmarkEnd w:id="99"/>
-    <w:bookmarkStart w:id="100" w:name="cicd"/>
+    <w:bookmarkStart w:id="102" w:name="cicd"/>
     <w:p>
       <w:pPr>
         <w:pStyle w:val="Heading2"/>
@@ -8250,13 +8587,31 @@
         <w:pStyle w:val="FirstParagraph"/>
       </w:pPr>
       <w:r>
-        <w:rPr>
-          <w:rStyle w:val="VerbatimChar"/>
-        </w:rPr>
-        <w:t xml:space="preserve">.github/workflows/deploy.yml</w:t>
-      </w:r>
-      <w:r>
-        <w:t xml:space="preserve">, due job in sequenza:</w:t>
+        <w:t xml:space="preserve">Due workflow GitHub Actions indipendenti, nessuno dei due dipende</w:t>
+      </w:r>
+      <w:r>
+        <w:t xml:space="preserve"> </w:t>
+      </w:r>
+      <w:r>
+        <w:t xml:space="preserve">dall’altro.</w:t>
+      </w:r>
+    </w:p>
+    <w:bookmarkStart w:id="100" w:name="deploy.yml-â-due-job-in-sequenza"/>
+    <w:p>
+      <w:pPr>
+        <w:pStyle w:val="Heading3"/>
+      </w:pPr>
+      <w:r>
+        <w:rPr>
+          <w:rStyle w:val="VerbatimChar"/>
+        </w:rPr>
+        <w:t xml:space="preserve">deploy.yml</w:t>
+      </w:r>
+      <w:r>
+        <w:t xml:space="preserve"> </w:t>
+      </w:r>
+      <w:r>
+        <w:t xml:space="preserve">â€” due job in sequenza</w:t>
       </w:r>
     </w:p>
     <w:p>
@@ -8504,7 +8859,390 @@
       </w:r>
     </w:p>
     <w:bookmarkEnd w:id="100"/>
-    <w:bookmarkStart w:id="101" w:name="convenzioni-di-sviluppo"/>
+    <w:bookmarkStart w:id="101" w:name="sonar.yml-â-analisi-sonarqube"/>
+    <w:p>
+      <w:pPr>
+        <w:pStyle w:val="Heading3"/>
+      </w:pPr>
+      <w:r>
+        <w:rPr>
+          <w:rStyle w:val="VerbatimChar"/>
+        </w:rPr>
+        <w:t xml:space="preserve">sonar.yml</w:t>
+      </w:r>
+      <w:r>
+        <w:t xml:space="preserve"> </w:t>
+      </w:r>
+      <w:r>
+        <w:t xml:space="preserve">â€” analisi SonarQube</w:t>
+      </w:r>
+    </w:p>
+    <w:p>
+      <w:pPr>
+        <w:pStyle w:val="FirstParagraph"/>
+      </w:pPr>
+      <w:r>
+        <w:t xml:space="preserve">Un solo job</w:t>
+      </w:r>
+      <w:r>
+        <w:t xml:space="preserve"> </w:t>
+      </w:r>
+      <w:r>
+        <w:rPr>
+          <w:rStyle w:val="VerbatimChar"/>
+        </w:rPr>
+        <w:t xml:space="preserve">sonar</w:t>
+      </w:r>
+      <w:r>
+        <w:t xml:space="preserve">, eseguito manualmente (</w:t>
+      </w:r>
+      <w:r>
+        <w:rPr>
+          <w:rStyle w:val="VerbatimChar"/>
+        </w:rPr>
+        <w:t xml:space="preserve">workflow_dispatch</w:t>
+      </w:r>
+      <w:r>
+        <w:t xml:space="preserve">) o ogni notte</w:t>
+      </w:r>
+      <w:r>
+        <w:t xml:space="preserve"> </w:t>
+      </w:r>
+      <w:r>
+        <w:t xml:space="preserve">alle 3 UTC (</w:t>
+      </w:r>
+      <w:r>
+        <w:rPr>
+          <w:rStyle w:val="VerbatimChar"/>
+        </w:rPr>
+        <w:t xml:space="preserve">schedule</w:t>
+      </w:r>
+      <w:r>
+        <w:t xml:space="preserve">),</w:t>
+      </w:r>
+      <w:r>
+        <w:t xml:space="preserve"> </w:t>
+      </w:r>
+      <w:r>
+        <w:rPr>
+          <w:b/>
+          <w:bCs/>
+        </w:rPr>
+        <w:t xml:space="preserve">non</w:t>
+      </w:r>
+      <w:r>
+        <w:t xml:space="preserve"> </w:t>
+      </w:r>
+      <w:r>
+        <w:t xml:space="preserve">su ogni push. Passi: container di servizio</w:t>
+      </w:r>
+      <w:r>
+        <w:t xml:space="preserve"> </w:t>
+      </w:r>
+      <w:r>
+        <w:t xml:space="preserve">PostgreSQL effimero (stesso schema del job</w:t>
+      </w:r>
+      <w:r>
+        <w:t xml:space="preserve"> </w:t>
+      </w:r>
+      <w:r>
+        <w:rPr>
+          <w:rStyle w:val="VerbatimChar"/>
+        </w:rPr>
+        <w:t xml:space="preserve">test</w:t>
+      </w:r>
+      <w:r>
+        <w:t xml:space="preserve"> </w:t>
+      </w:r>
+      <w:r>
+        <w:t xml:space="preserve">di</w:t>
+      </w:r>
+      <w:r>
+        <w:t xml:space="preserve"> </w:t>
+      </w:r>
+      <w:r>
+        <w:rPr>
+          <w:rStyle w:val="VerbatimChar"/>
+        </w:rPr>
+        <w:t xml:space="preserve">deploy.yml</w:t>
+      </w:r>
+      <w:r>
+        <w:t xml:space="preserve">),</w:t>
+      </w:r>
+      <w:r>
+        <w:t xml:space="preserve"> </w:t>
+      </w:r>
+      <w:r>
+        <w:rPr>
+          <w:rStyle w:val="VerbatimChar"/>
+        </w:rPr>
+        <w:t xml:space="preserve">npm ci</w:t>
+      </w:r>
+      <w:r>
+        <w:t xml:space="preserve">,</w:t>
+      </w:r>
+      <w:r>
+        <w:t xml:space="preserve"> </w:t>
+      </w:r>
+      <w:r>
+        <w:rPr>
+          <w:rStyle w:val="VerbatimChar"/>
+        </w:rPr>
+        <w:t xml:space="preserve">npm run test:coverage</w:t>
+      </w:r>
+      <w:r>
+        <w:t xml:space="preserve"> </w:t>
+      </w:r>
+      <w:r>
+        <w:t xml:space="preserve">(unit + integration test con report di</w:t>
+      </w:r>
+      <w:r>
+        <w:t xml:space="preserve"> </w:t>
+      </w:r>
+      <w:r>
+        <w:t xml:space="preserve">coverage</w:t>
+      </w:r>
+      <w:r>
+        <w:t xml:space="preserve"> </w:t>
+      </w:r>
+      <w:r>
+        <w:rPr>
+          <w:rStyle w:val="VerbatimChar"/>
+        </w:rPr>
+        <w:t xml:space="preserve">lcov</w:t>
+      </w:r>
+      <w:r>
+        <w:t xml:space="preserve"> </w:t>
+      </w:r>
+      <w:r>
+        <w:t xml:space="preserve">in</w:t>
+      </w:r>
+      <w:r>
+        <w:t xml:space="preserve"> </w:t>
+      </w:r>
+      <w:r>
+        <w:rPr>
+          <w:rStyle w:val="VerbatimChar"/>
+        </w:rPr>
+        <w:t xml:space="preserve">coverage/</w:t>
+      </w:r>
+      <w:r>
+        <w:t xml:space="preserve">), poi</w:t>
+      </w:r>
+      <w:r>
+        <w:t xml:space="preserve"> </w:t>
+      </w:r>
+      <w:r>
+        <w:rPr>
+          <w:rStyle w:val="VerbatimChar"/>
+        </w:rPr>
+        <w:t xml:space="preserve">SonarSource/sonarqube-scan-action@v4</w:t>
+      </w:r>
+      <w:r>
+        <w:t xml:space="preserve"> </w:t>
+      </w:r>
+      <w:r>
+        <w:t xml:space="preserve">(</w:t>
+      </w:r>
+      <w:r>
+        <w:rPr>
+          <w:rStyle w:val="VerbatimChar"/>
+        </w:rPr>
+        <w:t xml:space="preserve">SONAR_TOKEN</w:t>
+      </w:r>
+      <w:r>
+        <w:t xml:space="preserve">/</w:t>
+      </w:r>
+      <w:r>
+        <w:rPr>
+          <w:rStyle w:val="VerbatimChar"/>
+        </w:rPr>
+        <w:t xml:space="preserve">SONAR_HOST_URL</w:t>
+      </w:r>
+      <w:r>
+        <w:t xml:space="preserve"> </w:t>
+      </w:r>
+      <w:r>
+        <w:t xml:space="preserve">da secret del repository). La</w:t>
+      </w:r>
+      <w:r>
+        <w:t xml:space="preserve"> </w:t>
+      </w:r>
+      <w:r>
+        <w:t xml:space="preserve">configurazione dell’analisi Ã¨ in</w:t>
+      </w:r>
+      <w:r>
+        <w:t xml:space="preserve"> </w:t>
+      </w:r>
+      <w:r>
+        <w:rPr>
+          <w:rStyle w:val="VerbatimChar"/>
+        </w:rPr>
+        <w:t xml:space="preserve">sonar-project.properties</w:t>
+      </w:r>
+      <w:r>
+        <w:t xml:space="preserve">:</w:t>
+      </w:r>
+      <w:r>
+        <w:t xml:space="preserve"> </w:t>
+      </w:r>
+      <w:r>
+        <w:rPr>
+          <w:rStyle w:val="VerbatimChar"/>
+        </w:rPr>
+        <w:t xml:space="preserve">sources</w:t>
+      </w:r>
+      <w:r>
+        <w:t xml:space="preserve"> </w:t>
+      </w:r>
+      <w:r>
+        <w:t xml:space="preserve">copre</w:t>
+      </w:r>
+      <w:r>
+        <w:t xml:space="preserve"> </w:t>
+      </w:r>
+      <w:r>
+        <w:rPr>
+          <w:rStyle w:val="VerbatimChar"/>
+        </w:rPr>
+        <w:t xml:space="preserve">server</w:t>
+      </w:r>
+      <w:r>
+        <w:t xml:space="preserve">,</w:t>
+      </w:r>
+      <w:r>
+        <w:t xml:space="preserve"> </w:t>
+      </w:r>
+      <w:r>
+        <w:rPr>
+          <w:rStyle w:val="VerbatimChar"/>
+        </w:rPr>
+        <w:t xml:space="preserve">client/src</w:t>
+      </w:r>
+      <w:r>
+        <w:t xml:space="preserve">,</w:t>
+      </w:r>
+      <w:r>
+        <w:t xml:space="preserve"> </w:t>
+      </w:r>
+      <w:r>
+        <w:rPr>
+          <w:rStyle w:val="VerbatimChar"/>
+        </w:rPr>
+        <w:t xml:space="preserve">shared</w:t>
+      </w:r>
+      <w:r>
+        <w:t xml:space="preserve">;</w:t>
+      </w:r>
+      <w:r>
+        <w:t xml:space="preserve"> </w:t>
+      </w:r>
+      <w:r>
+        <w:rPr>
+          <w:rStyle w:val="VerbatimChar"/>
+        </w:rPr>
+        <w:t xml:space="preserve">client/src</w:t>
+      </w:r>
+      <w:r>
+        <w:t xml:space="preserve"> </w:t>
+      </w:r>
+      <w:r>
+        <w:t xml:space="preserve">Ã¨ escluso dal solo</w:t>
+      </w:r>
+      <w:r>
+        <w:t xml:space="preserve"> </w:t>
+      </w:r>
+      <w:r>
+        <w:rPr>
+          <w:b/>
+          <w:bCs/>
+        </w:rPr>
+        <w:t xml:space="preserve">calcolo della coverage</w:t>
+      </w:r>
+      <w:r>
+        <w:t xml:space="preserve"> </w:t>
+      </w:r>
+      <w:r>
+        <w:t xml:space="preserve">(</w:t>
+      </w:r>
+      <w:r>
+        <w:rPr>
+          <w:rStyle w:val="VerbatimChar"/>
+        </w:rPr>
+        <w:t xml:space="preserve">sonar.coverage.exclusions</w:t>
+      </w:r>
+      <w:r>
+        <w:t xml:space="preserve">, non</w:t>
+      </w:r>
+      <w:r>
+        <w:t xml:space="preserve"> </w:t>
+      </w:r>
+      <w:r>
+        <w:t xml:space="preserve">dall’analisi) perchÃ© non ha test unitari â€” solo test e2e Playwright, che</w:t>
+      </w:r>
+      <w:r>
+        <w:t xml:space="preserve"> </w:t>
+      </w:r>
+      <w:r>
+        <w:t xml:space="preserve">non producono un report di coverage consumabile da Sonar.</w:t>
+      </w:r>
+    </w:p>
+    <w:p>
+      <w:pPr>
+        <w:pStyle w:val="BodyText"/>
+      </w:pPr>
+      <w:r>
+        <w:t xml:space="preserve">Questo job non fa parte della catena di deploy: un fallimento della scan</w:t>
+      </w:r>
+      <w:r>
+        <w:t xml:space="preserve"> </w:t>
+      </w:r>
+      <w:r>
+        <w:t xml:space="preserve">Sonar (o del quality gate) non blocca</w:t>
+      </w:r>
+      <w:r>
+        <w:t xml:space="preserve"> </w:t>
+      </w:r>
+      <w:r>
+        <w:rPr>
+          <w:rStyle w:val="VerbatimChar"/>
+        </w:rPr>
+        <w:t xml:space="preserve">deploy.yml</w:t>
+      </w:r>
+      <w:r>
+        <w:t xml:space="preserve">, ed Ã¨ indipendente dal</w:t>
+      </w:r>
+      <w:r>
+        <w:t xml:space="preserve"> </w:t>
+      </w:r>
+      <w:r>
+        <w:t xml:space="preserve">job</w:t>
+      </w:r>
+      <w:r>
+        <w:t xml:space="preserve"> </w:t>
+      </w:r>
+      <w:r>
+        <w:rPr>
+          <w:rStyle w:val="VerbatimChar"/>
+        </w:rPr>
+        <w:t xml:space="preserve">test</w:t>
+      </w:r>
+      <w:r>
+        <w:t xml:space="preserve"> </w:t>
+      </w:r>
+      <w:r>
+        <w:t xml:space="preserve">di quel workflow (i due job avviano ciascuno il proprio Postgres</w:t>
+      </w:r>
+      <w:r>
+        <w:t xml:space="preserve"> </w:t>
+      </w:r>
+      <w:r>
+        <w:t xml:space="preserve">effimero e i propri test, senza condividerli).</w:t>
+      </w:r>
+    </w:p>
+    <w:bookmarkEnd w:id="101"/>
+    <w:bookmarkEnd w:id="102"/>
+    <w:bookmarkStart w:id="103" w:name="convenzioni-di-sviluppo"/>
     <w:p>
       <w:pPr>
         <w:pStyle w:val="Heading2"/>
@@ -8793,9 +9531,9 @@
         <w:t xml:space="preserve">.</w:t>
       </w:r>
     </w:p>
-    <w:bookmarkEnd w:id="101"/>
-    <w:bookmarkEnd w:id="102"/>
-    <w:bookmarkStart w:id="114" w:name="documentazione-di-sicurezza"/>
+    <w:bookmarkEnd w:id="103"/>
+    <w:bookmarkEnd w:id="104"/>
+    <w:bookmarkStart w:id="118" w:name="documentazione-di-sicurezza"/>
     <w:p>
       <w:pPr>
         <w:pStyle w:val="Heading1"/>
@@ -8804,7 +9542,7 @@
         <w:t xml:space="preserve">Documentazione di sicurezza</w:t>
       </w:r>
     </w:p>
-    <w:bookmarkStart w:id="103" w:name="autenticazione"/>
+    <w:bookmarkStart w:id="105" w:name="autenticazione"/>
     <w:p>
       <w:pPr>
         <w:pStyle w:val="Heading2"/>
@@ -9175,8 +9913,8 @@
         <w:t xml:space="preserve">revocati.</w:t>
       </w:r>
     </w:p>
-    <w:bookmarkEnd w:id="103"/>
-    <w:bookmarkStart w:id="108" w:name="autorizzazione-modello-a-permessi"/>
+    <w:bookmarkEnd w:id="105"/>
+    <w:bookmarkStart w:id="111" w:name="autorizzazione-modello-a-permessi"/>
     <w:p>
       <w:pPr>
         <w:pStyle w:val="Heading2"/>
@@ -9501,7 +10239,7 @@
         <w:t xml:space="preserve">tenere sincronizzato a mano.</w:t>
       </w:r>
     </w:p>
-    <w:bookmarkStart w:id="104" w:name="due-middleware-semantiche-diverse"/>
+    <w:bookmarkStart w:id="106" w:name="due-middleware-semantiche-diverse"/>
     <w:p>
       <w:pPr>
         <w:pStyle w:val="Heading3"/>
@@ -9752,8 +10490,8 @@
         <w:t xml:space="preserve">una persona (scrittura gated).</w:t>
       </w:r>
     </w:p>
-    <w:bookmarkEnd w:id="104"/>
-    <w:bookmarkStart w:id="105" w:name="matrice-endpoint-â-permesso-richiesto"/>
+    <w:bookmarkEnd w:id="106"/>
+    <w:bookmarkStart w:id="108" w:name="matrice-endpoint-â-permesso-richiesto"/>
     <w:p>
       <w:pPr>
         <w:pStyle w:val="Heading3"/>
@@ -10448,9 +11186,140 @@
           </w:p>
         </w:tc>
       </w:tr>
+      <w:tr>
+        <w:tc>
+          <w:tcPr/>
+          <w:p>
+            <w:pPr>
+              <w:pStyle w:val="Compact"/>
+            </w:pPr>
+            <w:r>
+              <w:rPr>
+                <w:rStyle w:val="VerbatimChar"/>
+              </w:rPr>
+              <w:t xml:space="preserve">/api/admin</w:t>
+            </w:r>
+          </w:p>
+        </w:tc>
+        <w:tc>
+          <w:tcPr/>
+          <w:p>
+            <w:pPr>
+              <w:pStyle w:val="Compact"/>
+            </w:pPr>
+            <w:r>
+              <w:rPr>
+                <w:rStyle w:val="VerbatimChar"/>
+              </w:rPr>
+              <w:t xml:space="preserve">requireAuth</w:t>
+            </w:r>
+            <w:r>
+              <w:t xml:space="preserve">, piÃ¹ un controllo</w:t>
+            </w:r>
+            <w:r>
+              <w:t xml:space="preserve"> </w:t>
+            </w:r>
+            <w:r>
+              <w:rPr>
+                <w:b/>
+                <w:bCs/>
+              </w:rPr>
+              <w:t xml:space="preserve">inline</w:t>
+            </w:r>
+            <w:r>
+              <w:t xml:space="preserve"> </w:t>
+            </w:r>
+            <w:r>
+              <w:t xml:space="preserve">nell’handler (</w:t>
+            </w:r>
+            <w:r>
+              <w:rPr>
+                <w:rStyle w:val="VerbatimChar"/>
+              </w:rPr>
+              <w:t xml:space="preserve">req.user?.permissions !== null</w:t>
+            </w:r>
+            <w:r>
+              <w:t xml:space="preserve">)</w:t>
+            </w:r>
+          </w:p>
+        </w:tc>
+        <w:tc>
+          <w:tcPr/>
+          <w:p>
+            <w:pPr>
+              <w:pStyle w:val="Compact"/>
+            </w:pPr>
+            <w:r>
+              <w:t xml:space="preserve">l’unico router protetto non da</w:t>
+            </w:r>
+            <w:r>
+              <w:t xml:space="preserve"> </w:t>
+            </w:r>
+            <w:r>
+              <w:rPr>
+                <w:rStyle w:val="VerbatimChar"/>
+              </w:rPr>
+              <w:t xml:space="preserve">requireTab</w:t>
+            </w:r>
+            <w:r>
+              <w:t xml:space="preserve">/</w:t>
+            </w:r>
+            <w:r>
+              <w:rPr>
+                <w:rStyle w:val="VerbatimChar"/>
+              </w:rPr>
+              <w:t xml:space="preserve">requireTabWrite</w:t>
+            </w:r>
+            <w:r>
+              <w:t xml:space="preserve"> </w:t>
+            </w:r>
+            <w:r>
+              <w:t xml:space="preserve">ma da un controllo ad-hoc: richiede che l’utente sia admin (</w:t>
+            </w:r>
+            <w:r>
+              <w:rPr>
+                <w:rStyle w:val="VerbatimChar"/>
+              </w:rPr>
+              <w:t xml:space="preserve">permissions === null</w:t>
+            </w:r>
+            <w:r>
+              <w:t xml:space="preserve">, accesso completo), non un permesso specifico su una sezione.</w:t>
+            </w:r>
+            <w:r>
+              <w:t xml:space="preserve"> </w:t>
+            </w:r>
+            <w:r>
+              <w:rPr>
+                <w:rStyle w:val="VerbatimChar"/>
+              </w:rPr>
+              <w:t xml:space="preserve">POST /admin/reset-data</w:t>
+            </w:r>
+            <w:r>
+              <w:t xml:space="preserve"> </w:t>
+            </w:r>
+            <w:r>
+              <w:t xml:space="preserve">tronca tutte le tabelle dati applicative (vedi</w:t>
+            </w:r>
+            <w:r>
+              <w:t xml:space="preserve"> </w:t>
+            </w:r>
+            <w:hyperlink r:id="rId107">
+              <w:r>
+                <w:rPr>
+                  <w:rStyle w:val="Hyperlink"/>
+                </w:rPr>
+                <w:t xml:space="preserve">01-funzionale.md Â§4.5</w:t>
+              </w:r>
+            </w:hyperlink>
+            <w:r>
+              <w:t xml:space="preserve">)</w:t>
+            </w:r>
+          </w:p>
+        </w:tc>
+      </w:tr>
     </w:tbl>
-    <w:bookmarkEnd w:id="105"/>
-    <w:bookmarkStart w:id="106" w:name="protezioni-anti-blocco-self-lockout"/>
+    <w:bookmarkEnd w:id="108"/>
+    <w:bookmarkStart w:id="109" w:name="protezioni-anti-blocco-self-lockout"/>
     <w:p>
       <w:pPr>
         <w:pStyle w:val="Heading3"/>
@@ -10606,8 +11475,8 @@
         <w:t xml:space="preserve">nell’interfaccia â€” non sono aggirabili chiamando l’API direttamente.</w:t>
       </w:r>
     </w:p>
-    <w:bookmarkEnd w:id="106"/>
-    <w:bookmarkStart w:id="107" w:name="difesa-in-profonditã-lato-client"/>
+    <w:bookmarkEnd w:id="109"/>
+    <w:bookmarkStart w:id="110" w:name="difesa-in-profonditã-lato-client"/>
     <w:p>
       <w:pPr>
         <w:pStyle w:val="Heading3"/>
@@ -10749,9 +11618,9 @@
         <w:t xml:space="preserve">mano o naviga dalla history del browser.</w:t>
       </w:r>
     </w:p>
-    <w:bookmarkEnd w:id="107"/>
-    <w:bookmarkEnd w:id="108"/>
-    <w:bookmarkStart w:id="110" w:name="audit-trail"/>
+    <w:bookmarkEnd w:id="110"/>
+    <w:bookmarkEnd w:id="111"/>
+    <w:bookmarkStart w:id="113" w:name="audit-trail"/>
     <w:p>
       <w:pPr>
         <w:pStyle w:val="Heading2"/>
@@ -10821,7 +11690,7 @@
       <w:r>
         <w:t xml:space="preserve"> </w:t>
       </w:r>
-      <w:hyperlink r:id="rId109">
+      <w:hyperlink r:id="rId112">
         <w:r>
           <w:rPr>
             <w:rStyle w:val="Hyperlink"/>
@@ -10845,8 +11714,8 @@
         <w:t xml:space="preserve">dell’entitÃ  coinvolta.</w:t>
       </w:r>
     </w:p>
-    <w:bookmarkEnd w:id="110"/>
-    <w:bookmarkStart w:id="111" w:name="gestione-dei-segreti"/>
+    <w:bookmarkEnd w:id="113"/>
+    <w:bookmarkStart w:id="114" w:name="gestione-dei-segreti"/>
     <w:p>
       <w:pPr>
         <w:pStyle w:val="Heading2"/>
@@ -11241,8 +12110,8 @@
         <w:t xml:space="preserve">documenta le chiavi attese senza valori reali.</w:t>
       </w:r>
     </w:p>
-    <w:bookmarkEnd w:id="111"/>
-    <w:bookmarkStart w:id="112" w:name="superficie-di-attacco-e-mitigazioni"/>
+    <w:bookmarkEnd w:id="114"/>
+    <w:bookmarkStart w:id="115" w:name="superficie-di-attacco-e-mitigazioni"/>
     <w:p>
       <w:pPr>
         <w:pStyle w:val="Heading2"/>
@@ -11503,8 +12372,8 @@
         </w:tc>
       </w:tr>
     </w:tbl>
-    <w:bookmarkEnd w:id="112"/>
-    <w:bookmarkStart w:id="113" w:name="rischi-noti-e-possibili-evoluzioni"/>
+    <w:bookmarkEnd w:id="115"/>
+    <w:bookmarkStart w:id="117" w:name="rischi-noti-e-possibili-evoluzioni"/>
     <w:p>
       <w:pPr>
         <w:pStyle w:val="Heading2"/>
@@ -11828,7 +12697,22 @@
           <w:b/>
           <w:bCs/>
         </w:rPr>
-        <w:t xml:space="preserve">Dipendenze con vulnerabilitÃ  note (basso rischio, solo devDependencies)</w:t>
+        <w:t xml:space="preserve">Dipendenza di produzione con vulnerabilitÃ  nota (</w:t>
+      </w:r>
+      <w:r>
+        <w:rPr>
+          <w:rStyle w:val="VerbatimChar"/>
+          <w:b/>
+          <w:bCs/>
+        </w:rPr>
+        <w:t xml:space="preserve">drizzle-orm</w:t>
+      </w:r>
+      <w:r>
+        <w:rPr>
+          <w:b/>
+          <w:bCs/>
+        </w:rPr>
+        <w:t xml:space="preserve">)</w:t>
       </w:r>
       <w:r>
         <w:t xml:space="preserve">:</w:t>
@@ -11840,25 +12724,133 @@
         <w:rPr>
           <w:rStyle w:val="VerbatimChar"/>
         </w:rPr>
+        <w:t xml:space="preserve">npm audit --omit=dev</w:t>
+      </w:r>
+      <w:r>
+        <w:t xml:space="preserve"> </w:t>
+      </w:r>
+      <w:r>
+        <w:t xml:space="preserve">(verificato il 2026-09-02) segnala una vulnerabilitÃ </w:t>
+      </w:r>
+      <w:r>
+        <w:t xml:space="preserve"> </w:t>
+      </w:r>
+      <w:r>
+        <w:rPr>
+          <w:b/>
+          <w:bCs/>
+        </w:rPr>
+        <w:t xml:space="preserve">high</w:t>
+      </w:r>
+      <w:r>
+        <w:t xml:space="preserve"> </w:t>
+      </w:r>
+      <w:r>
+        <w:t xml:space="preserve">in</w:t>
+      </w:r>
+      <w:r>
+        <w:t xml:space="preserve"> </w:t>
+      </w:r>
+      <w:r>
+        <w:rPr>
+          <w:rStyle w:val="VerbatimChar"/>
+        </w:rPr>
+        <w:t xml:space="preserve">drizzle-orm@0.31.4</w:t>
+      </w:r>
+      <w:r>
+        <w:t xml:space="preserve"> </w:t>
+      </w:r>
+      <w:r>
+        <w:t xml:space="preserve">(SQL injection via identificatori SQL</w:t>
+      </w:r>
+      <w:r>
+        <w:t xml:space="preserve"> </w:t>
+      </w:r>
+      <w:r>
+        <w:t xml:space="preserve">non correttamente escaped,</w:t>
+      </w:r>
+      <w:r>
+        <w:t xml:space="preserve"> </w:t>
+      </w:r>
+      <w:hyperlink r:id="rId116">
+        <w:r>
+          <w:rPr>
+            <w:rStyle w:val="Hyperlink"/>
+          </w:rPr>
+          <w:t xml:space="preserve">GHSA-gpj5-g38j-94v9</w:t>
+        </w:r>
+      </w:hyperlink>
+      <w:r>
+        <w:t xml:space="preserve">),</w:t>
+      </w:r>
+      <w:r>
+        <w:t xml:space="preserve"> </w:t>
+      </w:r>
+      <w:r>
+        <w:t xml:space="preserve">risolta in</w:t>
+      </w:r>
+      <w:r>
+        <w:t xml:space="preserve"> </w:t>
+      </w:r>
+      <w:r>
+        <w:rPr>
+          <w:rStyle w:val="VerbatimChar"/>
+        </w:rPr>
+        <w:t xml:space="preserve">drizzle-orm@0.45.2</w:t>
+      </w:r>
+      <w:r>
+        <w:t xml:space="preserve">. Ãˆ rilevante perchÃ© Drizzle Ã¨ proprio la</w:t>
+      </w:r>
+      <w:r>
+        <w:t xml:space="preserve"> </w:t>
+      </w:r>
+      <w:r>
+        <w:t xml:space="preserve">mitigazione indicata in questa stessa tabella per il rischio SQL injection</w:t>
+      </w:r>
+      <w:r>
+        <w:t xml:space="preserve"> </w:t>
+      </w:r>
+      <w:r>
+        <w:t xml:space="preserve">(Â§5) â€” va rivalutato l’aggiornamento (0.31.x â†’ 0.45.x Ã¨ un salto di major</w:t>
+      </w:r>
+      <w:r>
+        <w:t xml:space="preserve"> </w:t>
+      </w:r>
+      <w:r>
+        <w:t xml:space="preserve">minor con possibili breaking change, non ancora pianificato). Oltre a</w:t>
+      </w:r>
+      <w:r>
+        <w:t xml:space="preserve"> </w:t>
+      </w:r>
+      <w:r>
+        <w:t xml:space="preserve">questa,</w:t>
+      </w:r>
+      <w:r>
+        <w:t xml:space="preserve"> </w:t>
+      </w:r>
+      <w:r>
+        <w:rPr>
+          <w:rStyle w:val="VerbatimChar"/>
+        </w:rPr>
         <w:t xml:space="preserve">npm audit</w:t>
       </w:r>
       <w:r>
         <w:t xml:space="preserve"> </w:t>
       </w:r>
       <w:r>
-        <w:t xml:space="preserve">segnala alcune vulnerabilitÃ  moderate/alte in pacchetti di</w:t>
-      </w:r>
-      <w:r>
-        <w:t xml:space="preserve"> </w:t>
-      </w:r>
-      <w:r>
-        <w:t xml:space="preserve">sviluppo (build/test tooling), non nel bundle di produzione servito agli</w:t>
-      </w:r>
-      <w:r>
-        <w:t xml:space="preserve"> </w:t>
-      </w:r>
-      <w:r>
-        <w:t xml:space="preserve">utenti; da rivalutare periodicamente con</w:t>
+        <w:t xml:space="preserve">segnala ulteriori vulnerabilitÃ  moderate/alte ma solo</w:t>
+      </w:r>
+      <w:r>
+        <w:t xml:space="preserve"> </w:t>
+      </w:r>
+      <w:r>
+        <w:t xml:space="preserve">in devDependencies (build/test tooling), non presenti nel bundle servito</w:t>
+      </w:r>
+      <w:r>
+        <w:t xml:space="preserve"> </w:t>
+      </w:r>
+      <w:r>
+        <w:t xml:space="preserve">agli utenti; da rivalutare periodicamente con</w:t>
       </w:r>
       <w:r>
         <w:t xml:space="preserve"> </w:t>
@@ -11913,9 +12905,9 @@
         <w:t xml:space="preserve">di log/alerting (es. Application Insights) collegato all’App Service.</w:t>
       </w:r>
     </w:p>
-    <w:bookmarkEnd w:id="113"/>
-    <w:bookmarkEnd w:id="114"/>
-    <w:bookmarkStart w:id="127" w:name="backlog-prodotto-â-workforce-manager"/>
+    <w:bookmarkEnd w:id="117"/>
+    <w:bookmarkEnd w:id="118"/>
+    <w:bookmarkStart w:id="131" w:name="backlog-prodotto-â-workforce-manager"/>
     <w:p>
       <w:pPr>
         <w:pStyle w:val="Heading1"/>
@@ -12001,7 +12993,7 @@
         <w:t xml:space="preserve">: miglioramento utile, ma non bloccante.</w:t>
       </w:r>
     </w:p>
-    <w:bookmarkStart w:id="115" w:name="riepilogo"/>
+    <w:bookmarkStart w:id="119" w:name="riepilogo"/>
     <w:p>
       <w:pPr>
         <w:pStyle w:val="Heading2"/>
@@ -12484,8 +13476,8 @@
         </w:tc>
       </w:tr>
     </w:tbl>
-    <w:bookmarkEnd w:id="115"/>
-    <w:bookmarkStart w:id="123" w:name="item-dettagliati"/>
+    <w:bookmarkEnd w:id="119"/>
+    <w:bookmarkStart w:id="127" w:name="item-dettagliati"/>
     <w:p>
       <w:pPr>
         <w:pStyle w:val="Heading2"/>
@@ -12494,7 +13486,7 @@
         <w:t xml:space="preserve">Item dettagliati</w:t>
       </w:r>
     </w:p>
-    <w:bookmarkStart w:id="116" w:name="X4ee552e3f888228b45498b5a2448bffe768f9d9"/>
+    <w:bookmarkStart w:id="120" w:name="X4ee552e3f888228b45498b5a2448bffe768f9d9"/>
     <w:p>
       <w:pPr>
         <w:pStyle w:val="Heading3"/>
@@ -12669,8 +13661,8 @@
         <w:t xml:space="preserve">la regola Ã¨ coperta da test unitari e di integrazione.</w:t>
       </w:r>
     </w:p>
-    <w:bookmarkEnd w:id="116"/>
-    <w:bookmarkStart w:id="117" w:name="X40d31ab79f2bbeb99dc83f44d9ee5e35c36bf50"/>
+    <w:bookmarkEnd w:id="120"/>
+    <w:bookmarkStart w:id="121" w:name="X40d31ab79f2bbeb99dc83f44d9ee5e35c36bf50"/>
     <w:p>
       <w:pPr>
         <w:pStyle w:val="Heading3"/>
@@ -12896,8 +13888,8 @@
         <w:t xml:space="preserve">confermata la ripartizione su 7 giorni attualmente usata dai KPI.</w:t>
       </w:r>
     </w:p>
-    <w:bookmarkEnd w:id="117"/>
-    <w:bookmarkStart w:id="118" w:name="Xb5ea440199455fb79e2da82bd4ed5d5612aba02"/>
+    <w:bookmarkEnd w:id="121"/>
+    <w:bookmarkStart w:id="122" w:name="Xb5ea440199455fb79e2da82bd4ed5d5612aba02"/>
     <w:p>
       <w:pPr>
         <w:pStyle w:val="Heading3"/>
@@ -13084,8 +14076,8 @@
         <w:t xml:space="preserve">degli ID coinvolti.</w:t>
       </w:r>
     </w:p>
-    <w:bookmarkEnd w:id="118"/>
-    <w:bookmarkStart w:id="119" w:name="X1082c985a89be2cba459b236dc355c89f65aeeb"/>
+    <w:bookmarkEnd w:id="122"/>
+    <w:bookmarkStart w:id="123" w:name="X1082c985a89be2cba459b236dc355c89f65aeeb"/>
     <w:p>
       <w:pPr>
         <w:pStyle w:val="Heading3"/>
@@ -13248,8 +14240,8 @@
         <w:t xml:space="preserve">il filtro Ã¨ solo di presentazione e non modifica i dati del calendario.</w:t>
       </w:r>
     </w:p>
-    <w:bookmarkEnd w:id="119"/>
-    <w:bookmarkStart w:id="120" w:name="X009ae6d0814605f480aa4b6d1be4c18b05736b3"/>
+    <w:bookmarkEnd w:id="123"/>
+    <w:bookmarkStart w:id="124" w:name="X009ae6d0814605f480aa4b6d1be4c18b05736b3"/>
     <w:p>
       <w:pPr>
         <w:pStyle w:val="Heading3"/>
@@ -13470,8 +14462,8 @@
         <w:t xml:space="preserve">la metrica e la formula sono descritte nella UI o nella documentazione.</w:t>
       </w:r>
     </w:p>
-    <w:bookmarkEnd w:id="120"/>
-    <w:bookmarkStart w:id="121" w:name="X9d256234e30be203fcff0b8b274071bcd41b59b"/>
+    <w:bookmarkEnd w:id="124"/>
+    <w:bookmarkStart w:id="125" w:name="X9d256234e30be203fcff0b8b274071bcd41b59b"/>
     <w:p>
       <w:pPr>
         <w:pStyle w:val="Heading3"/>
@@ -13716,8 +14708,8 @@
         <w:t xml:space="preserve">aggiungere durata e unitÃ  di misura al modello dati, se non giÃ  disponibili.</w:t>
       </w:r>
     </w:p>
-    <w:bookmarkEnd w:id="121"/>
-    <w:bookmarkStart w:id="122" w:name="X3cfa56c398622bb2727930ee609f4d5f2687067"/>
+    <w:bookmarkEnd w:id="125"/>
+    <w:bookmarkStart w:id="126" w:name="X3cfa56c398622bb2727930ee609f4d5f2687067"/>
     <w:p>
       <w:pPr>
         <w:pStyle w:val="Heading3"/>
@@ -13892,9 +14884,9 @@
         <w:t xml:space="preserve">il comportamento Ã¨ coerente tra vista Lista e vista Per persona.</w:t>
       </w:r>
     </w:p>
-    <w:bookmarkEnd w:id="122"/>
-    <w:bookmarkEnd w:id="123"/>
-    <w:bookmarkStart w:id="124" w:name="ordine-suggerito-di-rilascio"/>
+    <w:bookmarkEnd w:id="126"/>
+    <w:bookmarkEnd w:id="127"/>
+    <w:bookmarkStart w:id="128" w:name="ordine-suggerito-di-rilascio"/>
     <w:p>
       <w:pPr>
         <w:pStyle w:val="Heading2"/>
@@ -14009,8 +15001,8 @@
         <w:t xml:space="preserve">ore/settimana â†’ ore/giorno.</w:t>
       </w:r>
     </w:p>
-    <w:bookmarkEnd w:id="124"/>
-    <w:bookmarkStart w:id="125" w:name="stato-implementazione-â-2026-09-04"/>
+    <w:bookmarkEnd w:id="128"/>
+    <w:bookmarkStart w:id="129" w:name="stato-implementazione-â-2026-09-04"/>
     <w:p>
       <w:pPr>
         <w:pStyle w:val="Heading2"/>
@@ -14231,8 +15223,8 @@
         <w:t xml:space="preserve">approvata blocca l’intera giornata di staffing.</w:t>
       </w:r>
     </w:p>
-    <w:bookmarkEnd w:id="125"/>
-    <w:bookmarkStart w:id="126" w:name="decisioni-aperte"/>
+    <w:bookmarkEnd w:id="129"/>
+    <w:bookmarkStart w:id="130" w:name="decisioni-aperte"/>
     <w:p>
       <w:pPr>
         <w:pStyle w:val="Heading2"/>
@@ -14432,8 +15424,8 @@
         </w:tc>
       </w:tr>
     </w:tbl>
-    <w:bookmarkEnd w:id="126"/>
-    <w:bookmarkEnd w:id="127"/>
+    <w:bookmarkEnd w:id="130"/>
+    <w:bookmarkEnd w:id="131"/>
     <w:sectPr>
       <w:footnotePr>
         <w:numRestart w:val="eachSect"/>

</xml_diff>